<commit_message>
tweak(EM): add birthday form participants in export teilnehmerliste
</commit_message>
<xml_diff>
--- a/tine20/EventManager/Export/templates/teilnehmerliste.docx
+++ b/tine20/EventManager/Export/templates/teilnehmerliste.docx
@@ -74,11 +74,12 @@
         <w:tblLook w:val="04a0" w:noVBand="1" w:noHBand="0" w:lastColumn="0" w:firstColumn="1" w:lastRow="0" w:firstRow="1"/>
       </w:tblPr>
       <w:tblGrid>
-        <w:gridCol w:w="1474"/>
-        <w:gridCol w:w="1807"/>
-        <w:gridCol w:w="2388"/>
-        <w:gridCol w:w="1297"/>
-        <w:gridCol w:w="3097"/>
+        <w:gridCol w:w="1248"/>
+        <w:gridCol w:w="1532"/>
+        <w:gridCol w:w="1926"/>
+        <w:gridCol w:w="1630"/>
+        <w:gridCol w:w="976"/>
+        <w:gridCol w:w="2750"/>
       </w:tblGrid>
       <w:tr>
         <w:trPr>
@@ -86,7 +87,7 @@
         </w:trPr>
         <w:tc>
           <w:tcPr>
-            <w:tcW w:w="1474" w:type="dxa"/>
+            <w:tcW w:w="1248" w:type="dxa"/>
             <w:tcBorders/>
             <w:shd w:color="auto" w:fill="auto" w:val="clear"/>
           </w:tcPr>
@@ -116,7 +117,7 @@
         </w:tc>
         <w:tc>
           <w:tcPr>
-            <w:tcW w:w="1807" w:type="dxa"/>
+            <w:tcW w:w="1532" w:type="dxa"/>
             <w:tcBorders/>
             <w:shd w:color="auto" w:fill="auto" w:val="clear"/>
           </w:tcPr>
@@ -146,7 +147,36 @@
         </w:tc>
         <w:tc>
           <w:tcPr>
-            <w:tcW w:w="2388" w:type="dxa"/>
+            <w:tcW w:w="1926" w:type="dxa"/>
+            <w:tcBorders/>
+            <w:shd w:color="auto" w:fill="auto" w:val="clear"/>
+          </w:tcPr>
+          <w:p>
+            <w:pPr>
+              <w:pStyle w:val="NoSpacing"/>
+              <w:widowControl w:val="false"/>
+              <w:jc w:val="center"/>
+              <w:rPr>
+                <w:b/>
+                <w:bCs/>
+                <w:sz w:val="24"/>
+                <w:szCs w:val="24"/>
+              </w:rPr>
+            </w:pPr>
+            <w:r>
+              <w:rPr>
+                <w:b/>
+                <w:bCs/>
+                <w:sz w:val="24"/>
+                <w:szCs w:val="24"/>
+              </w:rPr>
+              <w:t>Geburtsdatum</w:t>
+            </w:r>
+          </w:p>
+        </w:tc>
+        <w:tc>
+          <w:tcPr>
+            <w:tcW w:w="1630" w:type="dxa"/>
             <w:tcBorders/>
             <w:shd w:color="auto" w:fill="auto" w:val="clear"/>
           </w:tcPr>
@@ -176,7 +206,7 @@
         </w:tc>
         <w:tc>
           <w:tcPr>
-            <w:tcW w:w="1297" w:type="dxa"/>
+            <w:tcW w:w="976" w:type="dxa"/>
             <w:tcBorders/>
             <w:shd w:color="auto" w:fill="auto" w:val="clear"/>
           </w:tcPr>
@@ -206,7 +236,7 @@
         </w:tc>
         <w:tc>
           <w:tcPr>
-            <w:tcW w:w="3097" w:type="dxa"/>
+            <w:tcW w:w="2750" w:type="dxa"/>
             <w:tcBorders/>
             <w:shd w:color="auto" w:fill="auto" w:val="clear"/>
           </w:tcPr>
@@ -241,7 +271,7 @@
         </w:trPr>
         <w:tc>
           <w:tcPr>
-            <w:tcW w:w="1474" w:type="dxa"/>
+            <w:tcW w:w="1248" w:type="dxa"/>
             <w:tcBorders/>
             <w:shd w:color="auto" w:fill="auto" w:val="clear"/>
           </w:tcPr>
@@ -266,7 +296,7 @@
         </w:tc>
         <w:tc>
           <w:tcPr>
-            <w:tcW w:w="1807" w:type="dxa"/>
+            <w:tcW w:w="1532" w:type="dxa"/>
             <w:tcBorders/>
             <w:shd w:color="auto" w:fill="auto" w:val="clear"/>
           </w:tcPr>
@@ -290,7 +320,28 @@
         </w:tc>
         <w:tc>
           <w:tcPr>
-            <w:tcW w:w="2388" w:type="dxa"/>
+            <w:tcW w:w="1926" w:type="dxa"/>
+            <w:tcBorders/>
+            <w:shd w:color="auto" w:fill="auto" w:val="clear"/>
+          </w:tcPr>
+          <w:p>
+            <w:pPr>
+              <w:pStyle w:val="NoSpacing"/>
+              <w:widowControl w:val="false"/>
+              <w:rPr>
+                <w:rFonts w:ascii="Arial" w:hAnsi="Arial" w:eastAsia="Arial" w:cs="Arial"/>
+                <w:sz w:val="20"/>
+              </w:rPr>
+            </w:pPr>
+            <w:r>
+              <w:rPr/>
+              <w:t>{{ record.participant.bday|date('d.m.Y') }}</w:t>
+            </w:r>
+          </w:p>
+        </w:tc>
+        <w:tc>
+          <w:tcPr>
+            <w:tcW w:w="1630" w:type="dxa"/>
             <w:tcBorders/>
             <w:shd w:color="auto" w:fill="auto" w:val="clear"/>
           </w:tcPr>
@@ -351,7 +402,7 @@
         </w:tc>
         <w:tc>
           <w:tcPr>
-            <w:tcW w:w="1297" w:type="dxa"/>
+            <w:tcW w:w="976" w:type="dxa"/>
             <w:tcBorders/>
             <w:shd w:color="auto" w:fill="auto" w:val="clear"/>
           </w:tcPr>
@@ -378,7 +429,7 @@
         </w:tc>
         <w:tc>
           <w:tcPr>
-            <w:tcW w:w="3097" w:type="dxa"/>
+            <w:tcW w:w="2750" w:type="dxa"/>
             <w:tcBorders/>
             <w:shd w:color="auto" w:fill="auto" w:val="clear"/>
           </w:tcPr>

</xml_diff>